<commit_message>
docs: preserve example vector notation and unique drawing IDs
</commit_message>
<xml_diff>
--- a/docs/patents/point-mass-trajectory-reconstruction-technical-disclosure-no-figures.docx
+++ b/docs/patents/point-mass-trajectory-reconstruction-technical-disclosure-no-figures.docx
@@ -9329,8 +9329,32 @@
         <w:pStyle w:val="BodyText"/>
         <w:jc w:val="center"/>
       </w:pPr>
-      <w:r>
-        <w:t>q_i=((sinθ_i, cosθ_i, 1))/(√(sin^2θ_i+cos^2θ_i+1))=((sinθ_i, cosθ_i, 1))/(√(2)).</w:t>
+      <ns1:oMath>
+        <ns1:sSub>
+          <ns1:e>
+            <ns1:acc>
+              <ns1:accPr>
+                <ns1:chr ns1:val="̂"/>
+              </ns1:accPr>
+              <ns1:e>
+                <ns1:r>
+                  <ns1:rPr>
+                    <ns1:sty ns1:val="b"/>
+                  </ns1:rPr>
+                  <ns1:t>𝐪</ns1:t>
+                </ns1:r>
+              </ns1:e>
+            </ns1:acc>
+          </ns1:e>
+          <ns1:sub>
+            <ns1:r>
+              <ns1:t>i</ns1:t>
+            </ns1:r>
+          </ns1:sub>
+        </ns1:sSub>
+      </ns1:oMath>
+      <w:r>
+        <w:t>=((sinθ_i, cosθ_i, 1))/(√(sin²θ_i+cos²θ_i+1))=((sinθ_i, cosθ_i, 1))/(√(2)).</w:t>
       </w:r>
     </w:p>
     <w:p>
@@ -9547,7 +9571,7 @@
               <ns3:graphicData uri="http://schemas.openxmlformats.org/drawingml/2006/picture">
                 <ns4:pic>
                   <ns4:nvPicPr>
-                    <ns4:cNvPr descr="figures/test-pm-rviz-result.png" id="0" name="Picture"/>
+                    <ns4:cNvPr descr="figures/test-pm-rviz-result.png" id="1" name="Picture"/>
                     <ns4:cNvPicPr>
                       <ns3:picLocks noChangeArrowheads="1" noChangeAspect="1"/>
                     </ns4:cNvPicPr>
@@ -9699,12 +9723,12 @@
           <ns2:inline>
             <ns2:extent cx="5334000" cy="2667000"/>
             <ns2:effectExtent b="0" l="0" r="0" t="0"/>
-            <ns2:docPr descr="重构轨迹的位置数据曲线" title="" id="1" name="Picture"/>
+            <ns2:docPr descr="重构轨迹的位置数据曲线" title="" id="2" name="Picture"/>
             <ns3:graphic>
               <ns3:graphicData uri="http://schemas.openxmlformats.org/drawingml/2006/picture">
                 <ns4:pic>
                   <ns4:nvPicPr>
-                    <ns4:cNvPr descr="figures/test-pm-trajectory-curves.png" id="0" name="Picture"/>
+                    <ns4:cNvPr descr="figures/test-pm-trajectory-curves.png" id="2" name="Picture"/>
                     <ns4:cNvPicPr>
                       <ns3:picLocks noChangeArrowheads="1" noChangeAspect="1"/>
                     </ns4:cNvPicPr>

</xml_diff>